<commit_message>
docs: update test count to 170 and reference branches instead of commit hashes
</commit_message>
<xml_diff>
--- a/docs/Sprint 3/Hand-off note - Chat experience, Sprint 3 Week 2.docx
+++ b/docs/Sprint 3/Hand-off note - Chat experience, Sprint 3 Week 2.docx
@@ -917,7 +917,7 @@
         <w:spacing w:after="60"/>
       </w:pPr>
       <w:r>
-        <w:t>The wait is bounded on the server: each Gemini call now has a 15-second limit and moves on to the next key (commit 7cbfdf8). With two keys, the worst case is about 30 seconds before the employee sees an answer or a "busy, try again" message.</w:t>
+        <w:t>The wait is bounded on the server: each Gemini call now has a 15-second limit and moves on to the next key. With two keys, the worst case is about 30 seconds before the employee sees an answer or a "busy, try again" message.</w:t>
       </w:r>
     </w:p>
     <w:p>
@@ -6204,7 +6204,7 @@
         <w:spacing w:after="120"/>
       </w:pPr>
       <w:r>
-        <w:t>Commit a3ed7ae also holds two pieces of the next card ("AI shows a preview and the employee approves"), because they change the same chat screen:</w:t>
+        <w:t>The same change also holds two pieces of the next card ("AI shows a preview and the employee approves"), because they change the same chat screen:</w:t>
       </w:r>
     </w:p>
     <w:p>

</xml_diff>